<commit_message>
updated work from 3/6
</commit_message>
<xml_diff>
--- a/Tables/T1-T3-methods.docx
+++ b/Tables/T1-T3-methods.docx
@@ -25,7 +25,7 @@
           <w:szCs w:val="22"/>
           <w:color w:val="000000"/>
         </w:rPr>
-        <w:t xml:space="preserve">Table 1. Descriptive statistics of the cohort</w:t>
+        <w:t xml:space="preserve">Table 1 Statistical Methods</w:t>
       </w:r>
     </w:p>
     <w:p>
@@ -93,7 +93,7 @@
           <w:szCs w:val="22"/>
           <w:color w:val="000000"/>
         </w:rPr>
-        <w:t xml:space="preserve">Table 2. Demographic, clinical, and clinical course data in high-grade penetrating kidney injury patients stratified by index management strategy. All values are displayed as n (%), median [IQR], or mean ± SD as appropriate. Nonoperative management included interventional radiology and serial monitoring/conservative management. Calculations for Renal Salvage, AKI, ventilator days, ICU LOS, hospital LOS, and return to ED excluded patients who did not survive the index hospitalization. p-values &lt; 0.05 are printed in bold. *Defined as no further procedures or death following the index management strategy; however, nephrectomy at index procedure was not counted as successful index management / Table 3. Demographic, clinical, and outcomes data in high-grade penetrating kidney injury patients stratified by AAST injury grade. All values are displayed as n (%), median [IQR], or mean ± SD as appropriate. Calculations for Renal Salvage, AKI, ventilator days, ICU LOS, hospital LOS, and return to ED excluded patients who did not survive the index hospitalization. p-values &lt; 0.05 are printed in bold</w:t>
+        <w:t xml:space="preserve">Table 2 Statistical Methods</w:t>
       </w:r>
     </w:p>
     <w:p>
@@ -153,6 +153,74 @@
       <w:r>
         <w:rPr>
           <w:rFonts w:ascii="Arial" w:hAnsi="Arial" w:eastAsia="Arial" w:cs="Arial"/>
+          <w:i w:val="false"/>
+          <w:b w:val="true"/>
+          <w:u w:val="none"/>
+          <w:strike w:val="false"/>
+          <w:sz w:val="22"/>
+          <w:szCs w:val="22"/>
+          <w:color w:val="000000"/>
+        </w:rPr>
+        <w:t xml:space="preserve">Table 3 Statistical Methods</w:t>
+      </w:r>
+    </w:p>
+    <w:p>
+      <w:pPr>
+        <w:pStyle w:val="Normal"/>
+      </w:pPr>
+      <w:r>
+        <w:t xml:space="preserve"/>
+      </w:r>
+    </w:p>
+    <w:p>
+      <w:pPr>
+        <w:jc w:val="left"/>
+        <w:pBdr>
+          <w:bottom w:val="none" w:sz="0" w:space="0" w:color="000000"/>
+          <w:top w:val="none" w:sz="0" w:space="0" w:color="000000"/>
+          <w:left w:val="none" w:sz="0" w:space="0" w:color="000000"/>
+          <w:right w:val="none" w:sz="0" w:space="0" w:color="000000"/>
+        </w:pBdr>
+        <w:spacing w:after="0" w:before="0" w:line="240"/>
+        <w:ind w:left="0" w:right="0" w:firstLine="0" w:firstLineChars="0"/>
+      </w:pPr>
+      <w:r>
+        <w:rPr>
+          <w:rFonts w:ascii="Arial" w:hAnsi="Arial" w:eastAsia="Arial" w:cs="Arial"/>
+          <w:i w:val="false"/>
+          <w:b w:val="false"/>
+          <w:u w:val="none"/>
+          <w:strike w:val="false"/>
+          <w:sz w:val="22"/>
+          <w:szCs w:val="22"/>
+          <w:color w:val="000000"/>
+        </w:rPr>
+        <w:t xml:space="preserve">Continuous variables are presented as mean ± SD if normally distributed or median [IQR] if non-normally distributed or ordinal. Categorical variables are presented as n (%). Distribution of each continuous variable was evaluated using a sequential four-gate algorithm: variables with fewer than three observations in any comparison group were treated as non-normally distributed (conservative fail-safe); variables where any comparison group had absolute skewness exceeding 2.0 were treated as non-normally distributed regardless of sample size, as extreme skewness indicates a distribution for which parametric assumptions are inappropriate irrespective of the Central Limit Theorem; variables where all comparison groups comprised 30 or more observations were treated as normally distributed on the basis of the Central Limit Theorem; for all remaining variables, the Shapiro-Wilk test was applied within each comparison group, and p &gt; 0.05 in all groups was used as the threshold for normality. Normally distributed continuous variables were compared using Welch's one-way ANOVA; non-normally distributed variables were compared using the Kruskal-Wallis test. Omnibus P values are reported. For variables with a significant omnibus P value (p &lt; 0.05), pairwise post-hoc comparisons were performed: normally distributed variables were compared using the Games-Howell test; non-normally distributed and ordinal variables were compared using Dunn’s test with Holm correction for multiple comparisons. Results are presented using compact letter display (CLD) notation — superscript letters appended to cell values — whereby groups sharing a superscript letter are not significantly different from each other. Categorical variables were not included in post-hoc comparisons. Categorical variables were compared using Chi-squared tests, or Fisher's exact tests when any expected cell count was less than 5 (Cochran criterion). Statistical significance was defined as p &lt; 0.05.</w:t>
+      </w:r>
+    </w:p>
+    <w:p>
+      <w:pPr>
+        <w:pStyle w:val="Normal"/>
+      </w:pPr>
+      <w:r>
+        <w:t xml:space="preserve"/>
+      </w:r>
+    </w:p>
+    <w:p>
+      <w:pPr>
+        <w:jc w:val="left"/>
+        <w:pBdr>
+          <w:bottom w:val="none" w:sz="0" w:space="0" w:color="000000"/>
+          <w:top w:val="none" w:sz="0" w:space="0" w:color="000000"/>
+          <w:left w:val="none" w:sz="0" w:space="0" w:color="000000"/>
+          <w:right w:val="none" w:sz="0" w:space="0" w:color="000000"/>
+        </w:pBdr>
+        <w:spacing w:after="0" w:before="0" w:line="240"/>
+        <w:ind w:left="0" w:right="0" w:firstLine="0" w:firstLineChars="0"/>
+      </w:pPr>
+      <w:r>
+        <w:rPr>
+          <w:rFonts w:ascii="Arial" w:hAnsi="Arial" w:eastAsia="Arial" w:cs="Arial"/>
           <w:i w:val="true"/>
           <w:b w:val="false"/>
           <w:u w:val="none"/>
@@ -165,11 +233,12 @@
       </w:r>
     </w:p>
     <w:sectPr>
+      <w:footerReference w:officer="true" r:id="rId7" w:type="default">
+</w:footerReference>
+      <w:pgMar w:header="708" w:bottom="1417" w:top="1417" w:right="1417" w:left="1417" w:footer="708" w:gutter="0"/>
+      <w:pgSz w:h="16838" w:w="11906" w:orient="portrait"/>
       <w:type w:val="continuous"/>
-      <w:pgSz w:w="11900" w:h="16840"/>
-      <w:pgMar w:top="1417" w:right="1417" w:bottom="1417" w:left="1417" w:header="708" w:footer="708" w:gutter="0"/>
-      <w:cols w:space="708"/>
-      <w:docGrid w:linePitch="360"/>
+      <w:cols/>
     </w:sectPr>
   </w:body>
 </w:document>
@@ -178,6 +247,37 @@
 <file path=word/comments.xml><?xml version="1.0" encoding="utf-8"?>
 <w:comments xmlns:wpc="http://schemas.microsoft.com/office/word/2010/wordprocessingCanvas" xmlns:mo="http://schemas.microsoft.com/office/mac/office/2008/main" xmlns:mc="http://schemas.openxmlformats.org/markup-compatibility/2006" xmlns:mv="urn:schemas-microsoft-com:mac:vml" xmlns:o="urn:schemas-microsoft-com:office:office" xmlns:r="http://schemas.openxmlformats.org/officeDocument/2006/relationships" xmlns:m="http://schemas.openxmlformats.org/officeDocument/2006/math" xmlns:v="urn:schemas-microsoft-com:vml" xmlns:wp14="http://schemas.microsoft.com/office/word/2010/wordprocessingDrawing" xmlns:wp="http://schemas.openxmlformats.org/drawingml/2006/wordprocessingDrawing" xmlns:w10="urn:schemas-microsoft-com:office:word" xmlns:w="http://schemas.openxmlformats.org/wordprocessingml/2006/main" xmlns:w14="http://schemas.microsoft.com/office/word/2010/wordml" xmlns:wpg="http://schemas.microsoft.com/office/word/2010/wordprocessingGroup" xmlns:wpi="http://schemas.microsoft.com/office/word/2010/wordprocessingInk" xmlns:wne="http://schemas.microsoft.com/office/word/2006/wordml" xmlns:wps="http://schemas.microsoft.com/office/word/2010/wordprocessingShape" mc:Ignorable="w14 wp14">
 </w:comments>
+</file>
+
+<file path=word/footer1.xml><?xml version="1.0" encoding="utf-8"?>
+<w:ftr xmlns:wpc="http://schemas.microsoft.com/office/word/2010/wordprocessingCanvas" xmlns:cx="http://schemas.microsoft.com/office/drawing/2014/chartex" xmlns:cx1="http://schemas.microsoft.com/office/drawing/2015/9/8/chartex" xmlns:cx2="http://schemas.microsoft.com/office/drawing/2015/10/21/chartex" xmlns:cx3="http://schemas.microsoft.com/office/drawing/2016/5/9/chartex" xmlns:cx4="http://schemas.microsoft.com/office/drawing/2016/5/10/chartex" xmlns:cx5="http://schemas.microsoft.com/office/drawing/2016/5/11/chartex" xmlns:cx6="http://schemas.microsoft.com/office/drawing/2016/5/12/chartex" xmlns:cx7="http://schemas.microsoft.com/office/drawing/2016/5/13/chartex" xmlns:cx8="http://schemas.microsoft.com/office/drawing/2016/5/14/chartex" xmlns:mc="http://schemas.openxmlformats.org/markup-compatibility/2006" xmlns:aink="http://schemas.microsoft.com/office/drawing/2016/ink" xmlns:am3d="http://schemas.microsoft.com/office/drawing/2017/model3d" xmlns:o="urn:schemas-microsoft-com:office:office" xmlns:oel="http://schemas.microsoft.com/office/2019/extlst" xmlns:r="http://schemas.openxmlformats.org/officeDocument/2006/relationships" xmlns:m="http://schemas.openxmlformats.org/officeDocument/2006/math" xmlns:v="urn:schemas-microsoft-com:vml" xmlns:wp14="http://schemas.microsoft.com/office/word/2010/wordprocessingDrawing" xmlns:wp="http://schemas.openxmlformats.org/drawingml/2006/wordprocessingDrawing" xmlns:w10="urn:schemas-microsoft-com:office:word" xmlns:w="http://schemas.openxmlformats.org/wordprocessingml/2006/main" xmlns:w14="http://schemas.microsoft.com/office/word/2010/wordml" xmlns:w15="http://schemas.microsoft.com/office/word/2012/wordml" xmlns:w16cex="http://schemas.microsoft.com/office/word/2018/wordml/cex" xmlns:w16cid="http://schemas.microsoft.com/office/word/2016/wordml/cid" xmlns:w16="http://schemas.microsoft.com/office/word/2018/wordml" xmlns:w16sdtdh="http://schemas.microsoft.com/office/word/2020/wordml/sdtdatahash" xmlns:w16se="http://schemas.microsoft.com/office/word/2015/wordml/symex" xmlns:wpg="http://schemas.microsoft.com/office/word/2010/wordprocessingGroup" xmlns:wpi="http://schemas.microsoft.com/office/word/2010/wordprocessingInk" xmlns:wne="http://schemas.microsoft.com/office/word/2006/wordml" xmlns:wps="http://schemas.microsoft.com/office/word/2010/wordprocessingShape" mc:Ignorable="w14 w15 w16se w16cid w16 w16cex w16sdtdh wp14">
+  <w:p>
+    <w:pPr>
+      <w:jc w:val="left"/>
+      <w:pBdr>
+        <w:bottom w:val="none" w:sz="0" w:space="0" w:color="000000"/>
+        <w:top w:val="none" w:sz="0" w:space="0" w:color="000000"/>
+        <w:left w:val="none" w:sz="0" w:space="0" w:color="000000"/>
+        <w:right w:val="none" w:sz="0" w:space="0" w:color="000000"/>
+      </w:pBdr>
+      <w:spacing w:after="0" w:before="0" w:line="240"/>
+      <w:ind w:left="0" w:right="0" w:firstLine="0" w:firstLineChars="0"/>
+    </w:pPr>
+    <w:r>
+      <w:rPr>
+        <w:rFonts w:ascii="Arial" w:hAnsi="Arial" w:eastAsia="Arial" w:cs="Arial"/>
+        <w:i w:val="true"/>
+        <w:b w:val="true"/>
+        <w:u w:val="none"/>
+        <w:strike w:val="false"/>
+        <w:sz w:val="14"/>
+        <w:szCs w:val="14"/>
+        <w:color w:val="000000"/>
+      </w:rPr>
+      <w:t xml:space="preserve">Created with TernTables v1.6.3. Please cite: Preston JD, Abadiotakis H, Tang A, Aslam MV, Rust CJ, Chan JL. TernTables: Publication-ready summary tables and statistical testing for clinical research. R package version 1.6.3, 2026. Available at: https://github.com/jdpreston30/TernTables (Web interface: https://tern-tables.com)</w:t>
+    </w:r>
+  </w:p>
+</w:ftr>
 </file>
 
 <file path=word/footnotes.xml><?xml version="1.0" encoding="utf-8"?>

</xml_diff>